<commit_message>
Carry the role colours and weights into the printables
Booklet: circle options are bold in their box's colour, the given quote,
idea and purpose sit bold in their role colours, and page 1's map starts
and branch chips match. Stations: card and map text in the station's
colour.

Co-Authored-By: Claude Opus 5 <noreply@anthropic.com>
Claude-Session: https://claude.ai/code/session_01TX2KYiJGekMNoBBPASQh6e
</commit_message>
<xml_diff>
--- a/BoneSparrow-stations.docx
+++ b/BoneSparrow-stations.docx
@@ -81,7 +81,7 @@
                 <w:bCs/>
                 <w:i/>
                 <w:iCs/>
-                <w:color w:val="1E211F"/>
+                <w:color w:val="7A5A00"/>
                 <w:sz w:val="52"/>
                 <w:szCs w:val="52"/>
               </w:rPr>
@@ -190,7 +190,7 @@
                 <w:bCs/>
                 <w:i w:val="false"/>
                 <w:iCs w:val="false"/>
-                <w:color w:val="1E211F"/>
+                <w:color w:val="0B447C"/>
                 <w:sz w:val="96"/>
                 <w:szCs w:val="96"/>
               </w:rPr>
@@ -284,7 +284,7 @@
                 <w:bCs/>
                 <w:i w:val="false"/>
                 <w:iCs w:val="false"/>
-                <w:color w:val="1E211F"/>
+                <w:color w:val="1F5C33"/>
                 <w:sz w:val="52"/>
                 <w:szCs w:val="52"/>
               </w:rPr>
@@ -378,7 +378,7 @@
                 <w:bCs/>
                 <w:i/>
                 <w:iCs/>
-                <w:color w:val="1E211F"/>
+                <w:color w:val="7A5A00"/>
                 <w:sz w:val="52"/>
                 <w:szCs w:val="52"/>
               </w:rPr>
@@ -487,7 +487,7 @@
                 <w:bCs/>
                 <w:i w:val="false"/>
                 <w:iCs w:val="false"/>
-                <w:color w:val="1E211F"/>
+                <w:color w:val="0B447C"/>
                 <w:sz w:val="96"/>
                 <w:szCs w:val="96"/>
               </w:rPr>
@@ -581,7 +581,7 @@
                 <w:bCs/>
                 <w:i w:val="false"/>
                 <w:iCs w:val="false"/>
-                <w:color w:val="1E211F"/>
+                <w:color w:val="1F5C33"/>
                 <w:sz w:val="52"/>
                 <w:szCs w:val="52"/>
               </w:rPr>
@@ -701,11 +701,11 @@
             <w:r>
               <w:rPr>
                 <w:rFonts w:ascii="Georgia" w:cs="Georgia" w:eastAsia="Georgia" w:hAnsi="Georgia"/>
-                <w:b w:val="false"/>
-                <w:bCs w:val="false"/>
+                <w:b/>
+                <w:bCs/>
                 <w:i/>
                 <w:iCs/>
-                <w:color w:val="1E211F"/>
+                <w:color w:val="7A5A00"/>
                 <w:sz w:val="16"/>
                 <w:szCs w:val="16"/>
               </w:rPr>
@@ -785,7 +785,7 @@
                 <w:bCs/>
                 <w:i w:val="false"/>
                 <w:iCs w:val="false"/>
-                <w:color w:val="1E211F"/>
+                <w:color w:val="0B447C"/>
                 <w:sz w:val="26"/>
                 <w:szCs w:val="26"/>
               </w:rPr>
@@ -840,11 +840,11 @@
             <w:r>
               <w:rPr>
                 <w:rFonts w:ascii="Georgia" w:cs="Georgia" w:eastAsia="Georgia" w:hAnsi="Georgia"/>
-                <w:b w:val="false"/>
-                <w:bCs w:val="false"/>
+                <w:b/>
+                <w:bCs/>
                 <w:i w:val="false"/>
                 <w:iCs w:val="false"/>
-                <w:color w:val="1E211F"/>
+                <w:color w:val="1F5C33"/>
                 <w:sz w:val="16"/>
                 <w:szCs w:val="16"/>
               </w:rPr>
@@ -906,11 +906,11 @@
             <w:r>
               <w:rPr>
                 <w:rFonts w:ascii="Georgia" w:cs="Georgia" w:eastAsia="Georgia" w:hAnsi="Georgia"/>
-                <w:b w:val="false"/>
-                <w:bCs w:val="false"/>
+                <w:b/>
+                <w:bCs/>
                 <w:i w:val="false"/>
                 <w:iCs w:val="false"/>
-                <w:color w:val="1E211F"/>
+                <w:color w:val="1F5C33"/>
                 <w:sz w:val="16"/>
                 <w:szCs w:val="16"/>
               </w:rPr>
@@ -969,7 +969,7 @@
                 <w:bCs/>
                 <w:i w:val="false"/>
                 <w:iCs w:val="false"/>
-                <w:color w:val="1E211F"/>
+                <w:color w:val="0B447C"/>
                 <w:sz w:val="26"/>
                 <w:szCs w:val="26"/>
               </w:rPr>
@@ -1031,11 +1031,11 @@
             <w:r>
               <w:rPr>
                 <w:rFonts w:ascii="Georgia" w:cs="Georgia" w:eastAsia="Georgia" w:hAnsi="Georgia"/>
-                <w:b w:val="false"/>
-                <w:bCs w:val="false"/>
+                <w:b/>
+                <w:bCs/>
                 <w:i/>
                 <w:iCs/>
-                <w:color w:val="1E211F"/>
+                <w:color w:val="7A5A00"/>
                 <w:sz w:val="16"/>
                 <w:szCs w:val="16"/>
               </w:rPr>

</xml_diff>

<commit_message>
Stations: nine A3 posters, bigger words in a smaller box
Three quotes, three ideas, three effects. The cards are A3 portrait with
the box shrunk and the type up (38pt lines, 80pt idea words); the map
sheet holds nine nodes in three rows with gaps to draw through. Chapters
verified against the novel — the names line is chapter 2 — and no page
numbers anywhere.

Co-Authored-By: Claude Opus 5 <noreply@anthropic.com>
Claude-Session: https://claude.ai/code/session_01TX2KYiJGekMNoBBPASQh6e
</commit_message>
<xml_diff>
--- a/BoneSparrow-stations.docx
+++ b/BoneSparrow-stations.docx
@@ -14,8 +14,8 @@
           <w:bCs/>
           <w:color w:val="645D54"/>
           <w:spacing w:val="40"/>
-          <w:sz w:val="40"/>
-          <w:szCs w:val="40"/>
+          <w:sz w:val="52"/>
+          <w:szCs w:val="52"/>
         </w:rPr>
         <w:t xml:space="preserve">STATION 1</w:t>
       </w:r>
@@ -32,15 +32,15 @@
           <w:bCs/>
           <w:color w:val="7A5A00"/>
           <w:spacing w:val="60"/>
-          <w:sz w:val="56"/>
-          <w:szCs w:val="56"/>
+          <w:sz w:val="76"/>
+          <w:szCs w:val="76"/>
         </w:rPr>
         <w:t xml:space="preserve">EVIDENCE</w:t>
       </w:r>
     </w:p>
     <w:tbl>
       <w:tblPr>
-        <w:tblW w:type="dxa" w:w="10106"/>
+        <w:tblW w:type="dxa" w:w="14438"/>
         <w:tblBorders>
           <w:top w:val="single" w:color="7A5A00" w:sz="12"/>
           <w:left w:val="single" w:color="7A5A00" w:sz="12"/>
@@ -51,15 +51,15 @@
         </w:tblBorders>
       </w:tblPr>
       <w:tblGrid>
-        <w:gridCol w:w="10106"/>
+        <w:gridCol w:w="14438"/>
       </w:tblGrid>
       <w:tr>
         <w:trPr>
-          <w:trHeight w:val="5200" w:hRule="atLeast"/>
+          <w:trHeight w:val="4200" w:hRule="atLeast"/>
         </w:trPr>
         <w:tc>
           <w:tcPr>
-            <w:tcW w:type="dxa" w:w="10106"/>
+            <w:tcW w:type="dxa" w:w="14438"/>
             <w:shd w:fill="FFF3B0" w:color="auto" w:val="clear"/>
             <w:tcMar>
               <w:top w:type="dxa" w:w="400"/>
@@ -71,7 +71,7 @@
           </w:tcPr>
           <w:p>
             <w:pPr>
-              <w:spacing w:line="640" w:lineRule="exact"/>
+              <w:spacing w:line="960" w:lineRule="exact"/>
               <w:jc w:val="center"/>
             </w:pPr>
             <w:r>
@@ -82,8 +82,8 @@
                 <w:i/>
                 <w:iCs/>
                 <w:color w:val="7A5A00"/>
-                <w:sz w:val="52"/>
-                <w:szCs w:val="52"/>
+                <w:sz w:val="76"/>
+                <w:szCs w:val="76"/>
               </w:rPr>
               <w:t xml:space="preserve">“Sometimes, at night, the dirt outside turns into a beautiful ocean.”</w:t>
             </w:r>
@@ -100,8 +100,8 @@
         <w:rPr>
           <w:rFonts w:ascii="Calibri" w:cs="Calibri" w:eastAsia="Calibri" w:hAnsi="Calibri"/>
           <w:color w:val="645D54"/>
-          <w:sz w:val="30"/>
-          <w:szCs w:val="30"/>
+          <w:sz w:val="44"/>
+          <w:szCs w:val="44"/>
         </w:rPr>
         <w:t xml:space="preserve">Chapter 1</w:t>
       </w:r>
@@ -123,8 +123,8 @@
           <w:bCs/>
           <w:color w:val="645D54"/>
           <w:spacing w:val="40"/>
-          <w:sz w:val="40"/>
-          <w:szCs w:val="40"/>
+          <w:sz w:val="52"/>
+          <w:szCs w:val="52"/>
         </w:rPr>
         <w:t xml:space="preserve">STATION 2</w:t>
       </w:r>
@@ -141,15 +141,15 @@
           <w:bCs/>
           <w:color w:val="0B447C"/>
           <w:spacing w:val="60"/>
-          <w:sz w:val="56"/>
-          <w:szCs w:val="56"/>
+          <w:sz w:val="76"/>
+          <w:szCs w:val="76"/>
         </w:rPr>
         <w:t xml:space="preserve">IDEA</w:t>
       </w:r>
     </w:p>
     <w:tbl>
       <w:tblPr>
-        <w:tblW w:type="dxa" w:w="10106"/>
+        <w:tblW w:type="dxa" w:w="14438"/>
         <w:tblBorders>
           <w:top w:val="single" w:color="0B447C" w:sz="12"/>
           <w:left w:val="single" w:color="0B447C" w:sz="12"/>
@@ -160,15 +160,15 @@
         </w:tblBorders>
       </w:tblPr>
       <w:tblGrid>
-        <w:gridCol w:w="10106"/>
+        <w:gridCol w:w="14438"/>
       </w:tblGrid>
       <w:tr>
         <w:trPr>
-          <w:trHeight w:val="5200" w:hRule="atLeast"/>
+          <w:trHeight w:val="4200" w:hRule="atLeast"/>
         </w:trPr>
         <w:tc>
           <w:tcPr>
-            <w:tcW w:type="dxa" w:w="10106"/>
+            <w:tcW w:type="dxa" w:w="14438"/>
             <w:shd w:fill="D6EAFC" w:color="auto" w:val="clear"/>
             <w:tcMar>
               <w:top w:type="dxa" w:w="400"/>
@@ -180,7 +180,7 @@
           </w:tcPr>
           <w:p>
             <w:pPr>
-              <w:spacing w:line="640" w:lineRule="exact"/>
+              <w:spacing w:line="960" w:lineRule="exact"/>
               <w:jc w:val="center"/>
             </w:pPr>
             <w:r>
@@ -191,8 +191,8 @@
                 <w:i w:val="false"/>
                 <w:iCs w:val="false"/>
                 <w:color w:val="0B447C"/>
-                <w:sz w:val="96"/>
-                <w:szCs w:val="96"/>
+                <w:sz w:val="160"/>
+                <w:szCs w:val="160"/>
               </w:rPr>
               <w:t xml:space="preserve">imagination</w:t>
             </w:r>
@@ -217,8 +217,8 @@
           <w:bCs/>
           <w:color w:val="645D54"/>
           <w:spacing w:val="40"/>
-          <w:sz w:val="40"/>
-          <w:szCs w:val="40"/>
+          <w:sz w:val="52"/>
+          <w:szCs w:val="52"/>
         </w:rPr>
         <w:t xml:space="preserve">STATION 3</w:t>
       </w:r>
@@ -235,15 +235,15 @@
           <w:bCs/>
           <w:color w:val="1F5C33"/>
           <w:spacing w:val="60"/>
-          <w:sz w:val="56"/>
-          <w:szCs w:val="56"/>
+          <w:sz w:val="76"/>
+          <w:szCs w:val="76"/>
         </w:rPr>
         <w:t xml:space="preserve">EFFECT</w:t>
       </w:r>
     </w:p>
     <w:tbl>
       <w:tblPr>
-        <w:tblW w:type="dxa" w:w="10106"/>
+        <w:tblW w:type="dxa" w:w="14438"/>
         <w:tblBorders>
           <w:top w:val="single" w:color="1F5C33" w:sz="12"/>
           <w:left w:val="single" w:color="1F5C33" w:sz="12"/>
@@ -254,15 +254,15 @@
         </w:tblBorders>
       </w:tblPr>
       <w:tblGrid>
-        <w:gridCol w:w="10106"/>
+        <w:gridCol w:w="14438"/>
       </w:tblGrid>
       <w:tr>
         <w:trPr>
-          <w:trHeight w:val="5200" w:hRule="atLeast"/>
+          <w:trHeight w:val="4200" w:hRule="atLeast"/>
         </w:trPr>
         <w:tc>
           <w:tcPr>
-            <w:tcW w:type="dxa" w:w="10106"/>
+            <w:tcW w:type="dxa" w:w="14438"/>
             <w:shd w:fill="DFF0E2" w:color="auto" w:val="clear"/>
             <w:tcMar>
               <w:top w:type="dxa" w:w="400"/>
@@ -274,7 +274,7 @@
           </w:tcPr>
           <w:p>
             <w:pPr>
-              <w:spacing w:line="640" w:lineRule="exact"/>
+              <w:spacing w:line="960" w:lineRule="exact"/>
               <w:jc w:val="center"/>
             </w:pPr>
             <w:r>
@@ -285,8 +285,8 @@
                 <w:i w:val="false"/>
                 <w:iCs w:val="false"/>
                 <w:color w:val="1F5C33"/>
-                <w:sz w:val="52"/>
-                <w:szCs w:val="52"/>
+                <w:sz w:val="76"/>
+                <w:szCs w:val="76"/>
               </w:rPr>
               <w:t xml:space="preserve">makes the reader see the camp the way Subhi sees it</w:t>
             </w:r>
@@ -311,8 +311,8 @@
           <w:bCs/>
           <w:color w:val="645D54"/>
           <w:spacing w:val="40"/>
-          <w:sz w:val="40"/>
-          <w:szCs w:val="40"/>
+          <w:sz w:val="52"/>
+          <w:szCs w:val="52"/>
         </w:rPr>
         <w:t xml:space="preserve">STATION 4</w:t>
       </w:r>
@@ -329,15 +329,15 @@
           <w:bCs/>
           <w:color w:val="7A5A00"/>
           <w:spacing w:val="60"/>
-          <w:sz w:val="56"/>
-          <w:szCs w:val="56"/>
+          <w:sz w:val="76"/>
+          <w:szCs w:val="76"/>
         </w:rPr>
         <w:t xml:space="preserve">EVIDENCE</w:t>
       </w:r>
     </w:p>
     <w:tbl>
       <w:tblPr>
-        <w:tblW w:type="dxa" w:w="10106"/>
+        <w:tblW w:type="dxa" w:w="14438"/>
         <w:tblBorders>
           <w:top w:val="single" w:color="7A5A00" w:sz="12"/>
           <w:left w:val="single" w:color="7A5A00" w:sz="12"/>
@@ -348,15 +348,15 @@
         </w:tblBorders>
       </w:tblPr>
       <w:tblGrid>
-        <w:gridCol w:w="10106"/>
+        <w:gridCol w:w="14438"/>
       </w:tblGrid>
       <w:tr>
         <w:trPr>
-          <w:trHeight w:val="5200" w:hRule="atLeast"/>
+          <w:trHeight w:val="4200" w:hRule="atLeast"/>
         </w:trPr>
         <w:tc>
           <w:tcPr>
-            <w:tcW w:type="dxa" w:w="10106"/>
+            <w:tcW w:type="dxa" w:w="14438"/>
             <w:shd w:fill="FFF3B0" w:color="auto" w:val="clear"/>
             <w:tcMar>
               <w:top w:type="dxa" w:w="400"/>
@@ -368,7 +368,7 @@
           </w:tcPr>
           <w:p>
             <w:pPr>
-              <w:spacing w:line="640" w:lineRule="exact"/>
+              <w:spacing w:line="960" w:lineRule="exact"/>
               <w:jc w:val="center"/>
             </w:pPr>
             <w:r>
@@ -379,10 +379,10 @@
                 <w:i/>
                 <w:iCs/>
                 <w:color w:val="7A5A00"/>
-                <w:sz w:val="52"/>
-                <w:szCs w:val="52"/>
-              </w:rPr>
-              <w:t xml:space="preserve">“There are only fourteen pairs of real shoes in this whole entire camp.”</w:t>
+                <w:sz w:val="76"/>
+                <w:szCs w:val="76"/>
+              </w:rPr>
+              <w:t xml:space="preserve">“…learn their names so that he can talk with us for real, instead of talking to us by our numbers.”</w:t>
             </w:r>
           </w:p>
         </w:tc>
@@ -397,10 +397,10 @@
         <w:rPr>
           <w:rFonts w:ascii="Calibri" w:cs="Calibri" w:eastAsia="Calibri" w:hAnsi="Calibri"/>
           <w:color w:val="645D54"/>
-          <w:sz w:val="30"/>
-          <w:szCs w:val="30"/>
-        </w:rPr>
-        <w:t xml:space="preserve">Chapter 4</w:t>
+          <w:sz w:val="44"/>
+          <w:szCs w:val="44"/>
+        </w:rPr>
+        <w:t xml:space="preserve">Chapter 2</w:t>
       </w:r>
     </w:p>
     <w:p>
@@ -420,8 +420,8 @@
           <w:bCs/>
           <w:color w:val="645D54"/>
           <w:spacing w:val="40"/>
-          <w:sz w:val="40"/>
-          <w:szCs w:val="40"/>
+          <w:sz w:val="52"/>
+          <w:szCs w:val="52"/>
         </w:rPr>
         <w:t xml:space="preserve">STATION 5</w:t>
       </w:r>
@@ -438,15 +438,15 @@
           <w:bCs/>
           <w:color w:val="0B447C"/>
           <w:spacing w:val="60"/>
-          <w:sz w:val="56"/>
-          <w:szCs w:val="56"/>
+          <w:sz w:val="76"/>
+          <w:szCs w:val="76"/>
         </w:rPr>
         <w:t xml:space="preserve">IDEA</w:t>
       </w:r>
     </w:p>
     <w:tbl>
       <w:tblPr>
-        <w:tblW w:type="dxa" w:w="10106"/>
+        <w:tblW w:type="dxa" w:w="14438"/>
         <w:tblBorders>
           <w:top w:val="single" w:color="0B447C" w:sz="12"/>
           <w:left w:val="single" w:color="0B447C" w:sz="12"/>
@@ -457,15 +457,15 @@
         </w:tblBorders>
       </w:tblPr>
       <w:tblGrid>
-        <w:gridCol w:w="10106"/>
+        <w:gridCol w:w="14438"/>
       </w:tblGrid>
       <w:tr>
         <w:trPr>
-          <w:trHeight w:val="5200" w:hRule="atLeast"/>
+          <w:trHeight w:val="4200" w:hRule="atLeast"/>
         </w:trPr>
         <w:tc>
           <w:tcPr>
-            <w:tcW w:type="dxa" w:w="10106"/>
+            <w:tcW w:type="dxa" w:w="14438"/>
             <w:shd w:fill="D6EAFC" w:color="auto" w:val="clear"/>
             <w:tcMar>
               <w:top w:type="dxa" w:w="400"/>
@@ -477,7 +477,7 @@
           </w:tcPr>
           <w:p>
             <w:pPr>
-              <w:spacing w:line="640" w:lineRule="exact"/>
+              <w:spacing w:line="960" w:lineRule="exact"/>
               <w:jc w:val="center"/>
             </w:pPr>
             <w:r>
@@ -488,8 +488,8 @@
                 <w:i w:val="false"/>
                 <w:iCs w:val="false"/>
                 <w:color w:val="0B447C"/>
-                <w:sz w:val="96"/>
-                <w:szCs w:val="96"/>
+                <w:sz w:val="160"/>
+                <w:szCs w:val="160"/>
               </w:rPr>
               <w:t xml:space="preserve">power</w:t>
             </w:r>
@@ -514,8 +514,8 @@
           <w:bCs/>
           <w:color w:val="645D54"/>
           <w:spacing w:val="40"/>
-          <w:sz w:val="40"/>
-          <w:szCs w:val="40"/>
+          <w:sz w:val="52"/>
+          <w:szCs w:val="52"/>
         </w:rPr>
         <w:t xml:space="preserve">STATION 6</w:t>
       </w:r>
@@ -532,15 +532,15 @@
           <w:bCs/>
           <w:color w:val="1F5C33"/>
           <w:spacing w:val="60"/>
-          <w:sz w:val="56"/>
-          <w:szCs w:val="56"/>
+          <w:sz w:val="76"/>
+          <w:szCs w:val="76"/>
         </w:rPr>
         <w:t xml:space="preserve">EFFECT</w:t>
       </w:r>
     </w:p>
     <w:tbl>
       <w:tblPr>
-        <w:tblW w:type="dxa" w:w="10106"/>
+        <w:tblW w:type="dxa" w:w="14438"/>
         <w:tblBorders>
           <w:top w:val="single" w:color="1F5C33" w:sz="12"/>
           <w:left w:val="single" w:color="1F5C33" w:sz="12"/>
@@ -551,15 +551,15 @@
         </w:tblBorders>
       </w:tblPr>
       <w:tblGrid>
-        <w:gridCol w:w="10106"/>
+        <w:gridCol w:w="14438"/>
       </w:tblGrid>
       <w:tr>
         <w:trPr>
-          <w:trHeight w:val="5200" w:hRule="atLeast"/>
+          <w:trHeight w:val="4200" w:hRule="atLeast"/>
         </w:trPr>
         <w:tc>
           <w:tcPr>
-            <w:tcW w:type="dxa" w:w="10106"/>
+            <w:tcW w:type="dxa" w:w="14438"/>
             <w:shd w:fill="DFF0E2" w:color="auto" w:val="clear"/>
             <w:tcMar>
               <w:top w:type="dxa" w:w="400"/>
@@ -571,7 +571,7 @@
           </w:tcPr>
           <w:p>
             <w:pPr>
-              <w:spacing w:line="640" w:lineRule="exact"/>
+              <w:spacing w:line="960" w:lineRule="exact"/>
               <w:jc w:val="center"/>
             </w:pPr>
             <w:r>
@@ -582,20 +582,317 @@
                 <w:i w:val="false"/>
                 <w:iCs w:val="false"/>
                 <w:color w:val="1F5C33"/>
-                <w:sz w:val="52"/>
-                <w:szCs w:val="52"/>
-              </w:rPr>
-              <w:t xml:space="preserve">makes the reader feel how little the camp gives people</w:t>
+                <w:sz w:val="76"/>
+                <w:szCs w:val="76"/>
+              </w:rPr>
+              <w:t xml:space="preserve">makes the reader see the difference one kind person makes</w:t>
             </w:r>
           </w:p>
         </w:tc>
       </w:tr>
     </w:tbl>
     <w:p>
+      <w:r>
+        <w:br w:type="page"/>
+      </w:r>
+    </w:p>
+    <w:p>
+      <w:pPr>
+        <w:spacing w:after="600" w:before="1200"/>
+        <w:jc w:val="center"/>
+      </w:pPr>
+      <w:r>
+        <w:rPr>
+          <w:rFonts w:ascii="Calibri" w:cs="Calibri" w:eastAsia="Calibri" w:hAnsi="Calibri"/>
+          <w:b/>
+          <w:bCs/>
+          <w:color w:val="645D54"/>
+          <w:spacing w:val="40"/>
+          <w:sz w:val="52"/>
+          <w:szCs w:val="52"/>
+        </w:rPr>
+        <w:t xml:space="preserve">STATION 7</w:t>
+      </w:r>
+    </w:p>
+    <w:p>
+      <w:pPr>
+        <w:spacing w:after="1400"/>
+        <w:jc w:val="center"/>
+      </w:pPr>
+      <w:r>
+        <w:rPr>
+          <w:rFonts w:ascii="Calibri" w:cs="Calibri" w:eastAsia="Calibri" w:hAnsi="Calibri"/>
+          <w:b/>
+          <w:bCs/>
+          <w:color w:val="7A5A00"/>
+          <w:spacing w:val="60"/>
+          <w:sz w:val="76"/>
+          <w:szCs w:val="76"/>
+        </w:rPr>
+        <w:t xml:space="preserve">EVIDENCE</w:t>
+      </w:r>
+    </w:p>
+    <w:tbl>
+      <w:tblPr>
+        <w:tblW w:type="dxa" w:w="14438"/>
+        <w:tblBorders>
+          <w:top w:val="single" w:color="7A5A00" w:sz="12"/>
+          <w:left w:val="single" w:color="7A5A00" w:sz="12"/>
+          <w:bottom w:val="single" w:color="7A5A00" w:sz="12"/>
+          <w:right w:val="single" w:color="7A5A00" w:sz="12"/>
+          <w:insideH w:val="single" w:color="auto" w:sz="4"/>
+          <w:insideV w:val="single" w:color="auto" w:sz="4"/>
+        </w:tblBorders>
+      </w:tblPr>
+      <w:tblGrid>
+        <w:gridCol w:w="14438"/>
+      </w:tblGrid>
+      <w:tr>
+        <w:trPr>
+          <w:trHeight w:val="4200" w:hRule="atLeast"/>
+        </w:trPr>
+        <w:tc>
+          <w:tcPr>
+            <w:tcW w:type="dxa" w:w="14438"/>
+            <w:shd w:fill="FFF3B0" w:color="auto" w:val="clear"/>
+            <w:tcMar>
+              <w:top w:type="dxa" w:w="400"/>
+              <w:left w:type="dxa" w:w="500"/>
+              <w:bottom w:type="dxa" w:w="400"/>
+              <w:right w:type="dxa" w:w="500"/>
+            </w:tcMar>
+            <w:vAlign w:val="center"/>
+          </w:tcPr>
+          <w:p>
+            <w:pPr>
+              <w:spacing w:line="960" w:lineRule="exact"/>
+              <w:jc w:val="center"/>
+            </w:pPr>
+            <w:r>
+              <w:rPr>
+                <w:rFonts w:ascii="Georgia" w:cs="Georgia" w:eastAsia="Georgia" w:hAnsi="Georgia"/>
+                <w:b/>
+                <w:bCs/>
+                <w:i/>
+                <w:iCs/>
+                <w:color w:val="7A5A00"/>
+                <w:sz w:val="76"/>
+                <w:szCs w:val="76"/>
+              </w:rPr>
+              <w:t xml:space="preserve">“There are only fourteen pairs of real shoes in this whole entire camp.”</w:t>
+            </w:r>
+          </w:p>
+        </w:tc>
+      </w:tr>
+    </w:tbl>
+    <w:p>
+      <w:pPr>
+        <w:spacing w:before="500"/>
+        <w:jc w:val="center"/>
+      </w:pPr>
+      <w:r>
+        <w:rPr>
+          <w:rFonts w:ascii="Calibri" w:cs="Calibri" w:eastAsia="Calibri" w:hAnsi="Calibri"/>
+          <w:color w:val="645D54"/>
+          <w:sz w:val="44"/>
+          <w:szCs w:val="44"/>
+        </w:rPr>
+        <w:t xml:space="preserve">Chapter 4</w:t>
+      </w:r>
+    </w:p>
+    <w:p>
+      <w:r>
+        <w:br w:type="page"/>
+      </w:r>
+    </w:p>
+    <w:p>
+      <w:pPr>
+        <w:spacing w:after="600" w:before="1200"/>
+        <w:jc w:val="center"/>
+      </w:pPr>
+      <w:r>
+        <w:rPr>
+          <w:rFonts w:ascii="Calibri" w:cs="Calibri" w:eastAsia="Calibri" w:hAnsi="Calibri"/>
+          <w:b/>
+          <w:bCs/>
+          <w:color w:val="645D54"/>
+          <w:spacing w:val="40"/>
+          <w:sz w:val="52"/>
+          <w:szCs w:val="52"/>
+        </w:rPr>
+        <w:t xml:space="preserve">STATION 8</w:t>
+      </w:r>
+    </w:p>
+    <w:p>
+      <w:pPr>
+        <w:spacing w:after="1400"/>
+        <w:jc w:val="center"/>
+      </w:pPr>
+      <w:r>
+        <w:rPr>
+          <w:rFonts w:ascii="Calibri" w:cs="Calibri" w:eastAsia="Calibri" w:hAnsi="Calibri"/>
+          <w:b/>
+          <w:bCs/>
+          <w:color w:val="0B447C"/>
+          <w:spacing w:val="60"/>
+          <w:sz w:val="76"/>
+          <w:szCs w:val="76"/>
+        </w:rPr>
+        <w:t xml:space="preserve">IDEA</w:t>
+      </w:r>
+    </w:p>
+    <w:tbl>
+      <w:tblPr>
+        <w:tblW w:type="dxa" w:w="14438"/>
+        <w:tblBorders>
+          <w:top w:val="single" w:color="0B447C" w:sz="12"/>
+          <w:left w:val="single" w:color="0B447C" w:sz="12"/>
+          <w:bottom w:val="single" w:color="0B447C" w:sz="12"/>
+          <w:right w:val="single" w:color="0B447C" w:sz="12"/>
+          <w:insideH w:val="single" w:color="auto" w:sz="4"/>
+          <w:insideV w:val="single" w:color="auto" w:sz="4"/>
+        </w:tblBorders>
+      </w:tblPr>
+      <w:tblGrid>
+        <w:gridCol w:w="14438"/>
+      </w:tblGrid>
+      <w:tr>
+        <w:trPr>
+          <w:trHeight w:val="4200" w:hRule="atLeast"/>
+        </w:trPr>
+        <w:tc>
+          <w:tcPr>
+            <w:tcW w:type="dxa" w:w="14438"/>
+            <w:shd w:fill="D6EAFC" w:color="auto" w:val="clear"/>
+            <w:tcMar>
+              <w:top w:type="dxa" w:w="400"/>
+              <w:left w:type="dxa" w:w="500"/>
+              <w:bottom w:type="dxa" w:w="400"/>
+              <w:right w:type="dxa" w:w="500"/>
+            </w:tcMar>
+            <w:vAlign w:val="center"/>
+          </w:tcPr>
+          <w:p>
+            <w:pPr>
+              <w:spacing w:line="960" w:lineRule="exact"/>
+              <w:jc w:val="center"/>
+            </w:pPr>
+            <w:r>
+              <w:rPr>
+                <w:rFonts w:ascii="Georgia" w:cs="Georgia" w:eastAsia="Georgia" w:hAnsi="Georgia"/>
+                <w:b/>
+                <w:bCs/>
+                <w:i w:val="false"/>
+                <w:iCs w:val="false"/>
+                <w:color w:val="0B447C"/>
+                <w:sz w:val="160"/>
+                <w:szCs w:val="160"/>
+              </w:rPr>
+              <w:t xml:space="preserve">survival</w:t>
+            </w:r>
+          </w:p>
+        </w:tc>
+      </w:tr>
+    </w:tbl>
+    <w:p>
+      <w:r>
+        <w:br w:type="page"/>
+      </w:r>
+    </w:p>
+    <w:p>
+      <w:pPr>
+        <w:spacing w:after="600" w:before="1200"/>
+        <w:jc w:val="center"/>
+      </w:pPr>
+      <w:r>
+        <w:rPr>
+          <w:rFonts w:ascii="Calibri" w:cs="Calibri" w:eastAsia="Calibri" w:hAnsi="Calibri"/>
+          <w:b/>
+          <w:bCs/>
+          <w:color w:val="645D54"/>
+          <w:spacing w:val="40"/>
+          <w:sz w:val="52"/>
+          <w:szCs w:val="52"/>
+        </w:rPr>
+        <w:t xml:space="preserve">STATION 9</w:t>
+      </w:r>
+    </w:p>
+    <w:p>
+      <w:pPr>
+        <w:spacing w:after="1400"/>
+        <w:jc w:val="center"/>
+      </w:pPr>
+      <w:r>
+        <w:rPr>
+          <w:rFonts w:ascii="Calibri" w:cs="Calibri" w:eastAsia="Calibri" w:hAnsi="Calibri"/>
+          <w:b/>
+          <w:bCs/>
+          <w:color w:val="1F5C33"/>
+          <w:spacing w:val="60"/>
+          <w:sz w:val="76"/>
+          <w:szCs w:val="76"/>
+        </w:rPr>
+        <w:t xml:space="preserve">EFFECT</w:t>
+      </w:r>
+    </w:p>
+    <w:tbl>
+      <w:tblPr>
+        <w:tblW w:type="dxa" w:w="14438"/>
+        <w:tblBorders>
+          <w:top w:val="single" w:color="1F5C33" w:sz="12"/>
+          <w:left w:val="single" w:color="1F5C33" w:sz="12"/>
+          <w:bottom w:val="single" w:color="1F5C33" w:sz="12"/>
+          <w:right w:val="single" w:color="1F5C33" w:sz="12"/>
+          <w:insideH w:val="single" w:color="auto" w:sz="4"/>
+          <w:insideV w:val="single" w:color="auto" w:sz="4"/>
+        </w:tblBorders>
+      </w:tblPr>
+      <w:tblGrid>
+        <w:gridCol w:w="14438"/>
+      </w:tblGrid>
+      <w:tr>
+        <w:trPr>
+          <w:trHeight w:val="4200" w:hRule="atLeast"/>
+        </w:trPr>
+        <w:tc>
+          <w:tcPr>
+            <w:tcW w:type="dxa" w:w="14438"/>
+            <w:shd w:fill="DFF0E2" w:color="auto" w:val="clear"/>
+            <w:tcMar>
+              <w:top w:type="dxa" w:w="400"/>
+              <w:left w:type="dxa" w:w="500"/>
+              <w:bottom w:type="dxa" w:w="400"/>
+              <w:right w:type="dxa" w:w="500"/>
+            </w:tcMar>
+            <w:vAlign w:val="center"/>
+          </w:tcPr>
+          <w:p>
+            <w:pPr>
+              <w:spacing w:line="960" w:lineRule="exact"/>
+              <w:jc w:val="center"/>
+            </w:pPr>
+            <w:r>
+              <w:rPr>
+                <w:rFonts w:ascii="Georgia" w:cs="Georgia" w:eastAsia="Georgia" w:hAnsi="Georgia"/>
+                <w:b/>
+                <w:bCs/>
+                <w:i w:val="false"/>
+                <w:iCs w:val="false"/>
+                <w:color w:val="1F5C33"/>
+                <w:sz w:val="76"/>
+                <w:szCs w:val="76"/>
+              </w:rPr>
+              <w:t xml:space="preserve">makes the reader feel how little the camp gives people</w:t>
+            </w:r>
+          </w:p>
+        </w:tc>
+      </w:tr>
+    </w:tbl>
+    <w:p>
       <w:pPr>
         <w:sectPr>
-          <w:pgSz w:w="11906" w:h="16838" w:orient="portrait"/>
-          <w:pgMar w:top="900" w:right="900" w:bottom="900" w:left="900" w:header="708" w:footer="708" w:gutter="0"/>
+          <w:pgSz w:w="16838" w:h="23811" w:orient="portrait"/>
+          <w:pgMar w:top="1200" w:right="1200" w:bottom="1200" w:left="1200" w:header="708" w:footer="708" w:gutter="0"/>
           <w:pgNumType/>
           <w:docGrid w:linePitch="360"/>
         </w:sectPr>
@@ -626,7 +923,7 @@
     </w:p>
     <w:p>
       <w:pPr>
-        <w:spacing w:after="120"/>
+        <w:spacing w:after="100"/>
       </w:pPr>
       <w:r>
         <w:rPr>
@@ -651,17 +948,19 @@
         </w:tblBorders>
       </w:tblPr>
       <w:tblGrid>
-        <w:gridCol w:w="4746"/>
-        <w:gridCol w:w="4746"/>
-        <w:gridCol w:w="4746"/>
+        <w:gridCol w:w="4279"/>
+        <w:gridCol w:w="700"/>
+        <w:gridCol w:w="4279"/>
+        <w:gridCol w:w="700"/>
+        <w:gridCol w:w="4279"/>
       </w:tblGrid>
       <w:tr>
         <w:trPr>
-          <w:trHeight w:val="2400" w:hRule="atLeast"/>
+          <w:trHeight w:val="2000" w:hRule="atLeast"/>
         </w:trPr>
         <w:tc>
           <w:tcPr>
-            <w:tcW w:type="dxa" w:w="4746"/>
+            <w:tcW w:type="dxa" w:w="4279"/>
             <w:tcBorders>
               <w:top w:val="single" w:color="7A5A00" w:sz="8"/>
               <w:left w:val="single" w:color="7A5A00" w:sz="8"/>
@@ -729,7 +1028,7 @@
         </w:tc>
         <w:tc>
           <w:tcPr>
-            <w:tcW w:type="dxa" w:w="4746"/>
+            <w:tcW w:type="dxa" w:w="700"/>
             <w:tcBorders>
               <w:top w:val="none" w:color="FFFFFF" w:sz="0"/>
               <w:left w:val="none" w:color="FFFFFF" w:sz="0"/>
@@ -741,7 +1040,7 @@
         </w:tc>
         <w:tc>
           <w:tcPr>
-            <w:tcW w:type="dxa" w:w="4746"/>
+            <w:tcW w:type="dxa" w:w="4279"/>
             <w:tcBorders>
               <w:top w:val="single" w:color="0B447C" w:sz="8"/>
               <w:left w:val="single" w:color="0B447C" w:sz="8"/>
@@ -793,14 +1092,21 @@
             </w:r>
           </w:p>
         </w:tc>
-      </w:tr>
-      <w:tr>
-        <w:trPr>
-          <w:trHeight w:val="2900" w:hRule="atLeast"/>
-        </w:trPr>
-        <w:tc>
-          <w:tcPr>
-            <w:tcW w:type="dxa" w:w="4746"/>
+        <w:tc>
+          <w:tcPr>
+            <w:tcW w:type="dxa" w:w="700"/>
+            <w:tcBorders>
+              <w:top w:val="none" w:color="FFFFFF" w:sz="0"/>
+              <w:left w:val="none" w:color="FFFFFF" w:sz="0"/>
+              <w:bottom w:val="none" w:color="FFFFFF" w:sz="0"/>
+              <w:right w:val="none" w:color="FFFFFF" w:sz="0"/>
+            </w:tcBorders>
+          </w:tcPr>
+          <w:p/>
+        </w:tc>
+        <w:tc>
+          <w:tcPr>
+            <w:tcW w:type="dxa" w:w="4279"/>
             <w:tcBorders>
               <w:top w:val="single" w:color="1F5C33" w:sz="8"/>
               <w:left w:val="single" w:color="1F5C33" w:sz="8"/>
@@ -830,7 +1136,7 @@
                 <w:sz w:val="14"/>
                 <w:szCs w:val="14"/>
               </w:rPr>
-              <w:t xml:space="preserve">6 · EFFECT</w:t>
+              <w:t xml:space="preserve">3 · EFFECT</w:t>
             </w:r>
           </w:p>
           <w:p>
@@ -848,13 +1154,18 @@
                 <w:sz w:val="16"/>
                 <w:szCs w:val="16"/>
               </w:rPr>
-              <w:t xml:space="preserve">makes the reader feel how little the camp gives people</w:t>
-            </w:r>
-          </w:p>
-        </w:tc>
-        <w:tc>
-          <w:tcPr>
-            <w:tcW w:type="dxa" w:w="4746"/>
+              <w:t xml:space="preserve">makes the reader see the camp the way Subhi sees it</w:t>
+            </w:r>
+          </w:p>
+        </w:tc>
+      </w:tr>
+      <w:tr>
+        <w:trPr>
+          <w:trHeight w:val="1000" w:hRule="atLeast"/>
+        </w:trPr>
+        <w:tc>
+          <w:tcPr>
+            <w:tcW w:type="dxa" w:w="4279"/>
             <w:tcBorders>
               <w:top w:val="none" w:color="FFFFFF" w:sz="0"/>
               <w:left w:val="none" w:color="FFFFFF" w:sz="0"/>
@@ -866,7 +1177,206 @@
         </w:tc>
         <w:tc>
           <w:tcPr>
-            <w:tcW w:type="dxa" w:w="4746"/>
+            <w:tcW w:type="dxa" w:w="700"/>
+            <w:tcBorders>
+              <w:top w:val="none" w:color="FFFFFF" w:sz="0"/>
+              <w:left w:val="none" w:color="FFFFFF" w:sz="0"/>
+              <w:bottom w:val="none" w:color="FFFFFF" w:sz="0"/>
+              <w:right w:val="none" w:color="FFFFFF" w:sz="0"/>
+            </w:tcBorders>
+          </w:tcPr>
+          <w:p/>
+        </w:tc>
+        <w:tc>
+          <w:tcPr>
+            <w:tcW w:type="dxa" w:w="4279"/>
+            <w:tcBorders>
+              <w:top w:val="none" w:color="FFFFFF" w:sz="0"/>
+              <w:left w:val="none" w:color="FFFFFF" w:sz="0"/>
+              <w:bottom w:val="none" w:color="FFFFFF" w:sz="0"/>
+              <w:right w:val="none" w:color="FFFFFF" w:sz="0"/>
+            </w:tcBorders>
+          </w:tcPr>
+          <w:p/>
+        </w:tc>
+        <w:tc>
+          <w:tcPr>
+            <w:tcW w:type="dxa" w:w="700"/>
+            <w:tcBorders>
+              <w:top w:val="none" w:color="FFFFFF" w:sz="0"/>
+              <w:left w:val="none" w:color="FFFFFF" w:sz="0"/>
+              <w:bottom w:val="none" w:color="FFFFFF" w:sz="0"/>
+              <w:right w:val="none" w:color="FFFFFF" w:sz="0"/>
+            </w:tcBorders>
+          </w:tcPr>
+          <w:p/>
+        </w:tc>
+        <w:tc>
+          <w:tcPr>
+            <w:tcW w:type="dxa" w:w="4279"/>
+            <w:tcBorders>
+              <w:top w:val="none" w:color="FFFFFF" w:sz="0"/>
+              <w:left w:val="none" w:color="FFFFFF" w:sz="0"/>
+              <w:bottom w:val="none" w:color="FFFFFF" w:sz="0"/>
+              <w:right w:val="none" w:color="FFFFFF" w:sz="0"/>
+            </w:tcBorders>
+          </w:tcPr>
+          <w:p/>
+        </w:tc>
+      </w:tr>
+      <w:tr>
+        <w:trPr>
+          <w:trHeight w:val="2000" w:hRule="atLeast"/>
+        </w:trPr>
+        <w:tc>
+          <w:tcPr>
+            <w:tcW w:type="dxa" w:w="4279"/>
+            <w:tcBorders>
+              <w:top w:val="single" w:color="7A5A00" w:sz="8"/>
+              <w:left w:val="single" w:color="7A5A00" w:sz="8"/>
+              <w:bottom w:val="single" w:color="7A5A00" w:sz="8"/>
+              <w:right w:val="single" w:color="7A5A00" w:sz="8"/>
+            </w:tcBorders>
+            <w:shd w:fill="FFF3B0" w:color="auto" w:val="clear"/>
+            <w:tcMar>
+              <w:top w:type="dxa" w:w="120"/>
+              <w:left w:type="dxa" w:w="160"/>
+              <w:bottom w:type="dxa" w:w="120"/>
+              <w:right w:type="dxa" w:w="160"/>
+            </w:tcMar>
+            <w:vAlign w:val="center"/>
+          </w:tcPr>
+          <w:p>
+            <w:pPr>
+              <w:spacing w:after="40"/>
+              <w:jc w:val="center"/>
+            </w:pPr>
+            <w:r>
+              <w:rPr>
+                <w:rFonts w:ascii="Calibri" w:cs="Calibri" w:eastAsia="Calibri" w:hAnsi="Calibri"/>
+                <w:b/>
+                <w:bCs/>
+                <w:color w:val="7A5A00"/>
+                <w:sz w:val="14"/>
+                <w:szCs w:val="14"/>
+              </w:rPr>
+              <w:t xml:space="preserve">4 · EVIDENCE</w:t>
+            </w:r>
+          </w:p>
+          <w:p>
+            <w:pPr>
+              <w:jc w:val="center"/>
+            </w:pPr>
+            <w:r>
+              <w:rPr>
+                <w:rFonts w:ascii="Georgia" w:cs="Georgia" w:eastAsia="Georgia" w:hAnsi="Georgia"/>
+                <w:b/>
+                <w:bCs/>
+                <w:i/>
+                <w:iCs/>
+                <w:color w:val="7A5A00"/>
+                <w:sz w:val="16"/>
+                <w:szCs w:val="16"/>
+              </w:rPr>
+              <w:t xml:space="preserve">“…learn their names so that he can talk with us for real, instead of talking to us by our numbers.”</w:t>
+            </w:r>
+          </w:p>
+          <w:p>
+            <w:pPr>
+              <w:jc w:val="center"/>
+            </w:pPr>
+            <w:r>
+              <w:rPr>
+                <w:rFonts w:ascii="Calibri" w:cs="Calibri" w:eastAsia="Calibri" w:hAnsi="Calibri"/>
+                <w:color w:val="645D54"/>
+                <w:sz w:val="12"/>
+                <w:szCs w:val="12"/>
+              </w:rPr>
+              <w:t xml:space="preserve">Chapter 2</w:t>
+            </w:r>
+          </w:p>
+        </w:tc>
+        <w:tc>
+          <w:tcPr>
+            <w:tcW w:type="dxa" w:w="700"/>
+            <w:tcBorders>
+              <w:top w:val="none" w:color="FFFFFF" w:sz="0"/>
+              <w:left w:val="none" w:color="FFFFFF" w:sz="0"/>
+              <w:bottom w:val="none" w:color="FFFFFF" w:sz="0"/>
+              <w:right w:val="none" w:color="FFFFFF" w:sz="0"/>
+            </w:tcBorders>
+          </w:tcPr>
+          <w:p/>
+        </w:tc>
+        <w:tc>
+          <w:tcPr>
+            <w:tcW w:type="dxa" w:w="4279"/>
+            <w:tcBorders>
+              <w:top w:val="single" w:color="0B447C" w:sz="8"/>
+              <w:left w:val="single" w:color="0B447C" w:sz="8"/>
+              <w:bottom w:val="single" w:color="0B447C" w:sz="8"/>
+              <w:right w:val="single" w:color="0B447C" w:sz="8"/>
+            </w:tcBorders>
+            <w:shd w:fill="D6EAFC" w:color="auto" w:val="clear"/>
+            <w:tcMar>
+              <w:top w:type="dxa" w:w="120"/>
+              <w:left w:type="dxa" w:w="160"/>
+              <w:bottom w:type="dxa" w:w="120"/>
+              <w:right w:type="dxa" w:w="160"/>
+            </w:tcMar>
+            <w:vAlign w:val="center"/>
+          </w:tcPr>
+          <w:p>
+            <w:pPr>
+              <w:spacing w:after="40"/>
+              <w:jc w:val="center"/>
+            </w:pPr>
+            <w:r>
+              <w:rPr>
+                <w:rFonts w:ascii="Calibri" w:cs="Calibri" w:eastAsia="Calibri" w:hAnsi="Calibri"/>
+                <w:b/>
+                <w:bCs/>
+                <w:color w:val="0B447C"/>
+                <w:sz w:val="14"/>
+                <w:szCs w:val="14"/>
+              </w:rPr>
+              <w:t xml:space="preserve">5 · IDEA</w:t>
+            </w:r>
+          </w:p>
+          <w:p>
+            <w:pPr>
+              <w:jc w:val="center"/>
+            </w:pPr>
+            <w:r>
+              <w:rPr>
+                <w:rFonts w:ascii="Georgia" w:cs="Georgia" w:eastAsia="Georgia" w:hAnsi="Georgia"/>
+                <w:b/>
+                <w:bCs/>
+                <w:i w:val="false"/>
+                <w:iCs w:val="false"/>
+                <w:color w:val="0B447C"/>
+                <w:sz w:val="26"/>
+                <w:szCs w:val="26"/>
+              </w:rPr>
+              <w:t xml:space="preserve">power</w:t>
+            </w:r>
+          </w:p>
+        </w:tc>
+        <w:tc>
+          <w:tcPr>
+            <w:tcW w:type="dxa" w:w="700"/>
+            <w:tcBorders>
+              <w:top w:val="none" w:color="FFFFFF" w:sz="0"/>
+              <w:left w:val="none" w:color="FFFFFF" w:sz="0"/>
+              <w:bottom w:val="none" w:color="FFFFFF" w:sz="0"/>
+              <w:right w:val="none" w:color="FFFFFF" w:sz="0"/>
+            </w:tcBorders>
+          </w:tcPr>
+          <w:p/>
+        </w:tc>
+        <w:tc>
+          <w:tcPr>
+            <w:tcW w:type="dxa" w:w="4279"/>
             <w:tcBorders>
               <w:top w:val="single" w:color="1F5C33" w:sz="8"/>
               <w:left w:val="single" w:color="1F5C33" w:sz="8"/>
@@ -896,7 +1406,7 @@
                 <w:sz w:val="14"/>
                 <w:szCs w:val="14"/>
               </w:rPr>
-              <w:t xml:space="preserve">3 · EFFECT</w:t>
+              <w:t xml:space="preserve">6 · EFFECT</w:t>
             </w:r>
           </w:p>
           <w:p>
@@ -914,18 +1424,163 @@
                 <w:sz w:val="16"/>
                 <w:szCs w:val="16"/>
               </w:rPr>
-              <w:t xml:space="preserve">makes the reader see the camp the way Subhi sees it</w:t>
+              <w:t xml:space="preserve">makes the reader see the difference one kind person makes</w:t>
             </w:r>
           </w:p>
         </w:tc>
       </w:tr>
       <w:tr>
         <w:trPr>
-          <w:trHeight w:val="2400" w:hRule="atLeast"/>
+          <w:trHeight w:val="1000" w:hRule="atLeast"/>
         </w:trPr>
         <w:tc>
           <w:tcPr>
-            <w:tcW w:type="dxa" w:w="4746"/>
+            <w:tcW w:type="dxa" w:w="4279"/>
+            <w:tcBorders>
+              <w:top w:val="none" w:color="FFFFFF" w:sz="0"/>
+              <w:left w:val="none" w:color="FFFFFF" w:sz="0"/>
+              <w:bottom w:val="none" w:color="FFFFFF" w:sz="0"/>
+              <w:right w:val="none" w:color="FFFFFF" w:sz="0"/>
+            </w:tcBorders>
+          </w:tcPr>
+          <w:p/>
+        </w:tc>
+        <w:tc>
+          <w:tcPr>
+            <w:tcW w:type="dxa" w:w="700"/>
+            <w:tcBorders>
+              <w:top w:val="none" w:color="FFFFFF" w:sz="0"/>
+              <w:left w:val="none" w:color="FFFFFF" w:sz="0"/>
+              <w:bottom w:val="none" w:color="FFFFFF" w:sz="0"/>
+              <w:right w:val="none" w:color="FFFFFF" w:sz="0"/>
+            </w:tcBorders>
+          </w:tcPr>
+          <w:p/>
+        </w:tc>
+        <w:tc>
+          <w:tcPr>
+            <w:tcW w:type="dxa" w:w="4279"/>
+            <w:tcBorders>
+              <w:top w:val="none" w:color="FFFFFF" w:sz="0"/>
+              <w:left w:val="none" w:color="FFFFFF" w:sz="0"/>
+              <w:bottom w:val="none" w:color="FFFFFF" w:sz="0"/>
+              <w:right w:val="none" w:color="FFFFFF" w:sz="0"/>
+            </w:tcBorders>
+          </w:tcPr>
+          <w:p/>
+        </w:tc>
+        <w:tc>
+          <w:tcPr>
+            <w:tcW w:type="dxa" w:w="700"/>
+            <w:tcBorders>
+              <w:top w:val="none" w:color="FFFFFF" w:sz="0"/>
+              <w:left w:val="none" w:color="FFFFFF" w:sz="0"/>
+              <w:bottom w:val="none" w:color="FFFFFF" w:sz="0"/>
+              <w:right w:val="none" w:color="FFFFFF" w:sz="0"/>
+            </w:tcBorders>
+          </w:tcPr>
+          <w:p/>
+        </w:tc>
+        <w:tc>
+          <w:tcPr>
+            <w:tcW w:type="dxa" w:w="4279"/>
+            <w:tcBorders>
+              <w:top w:val="none" w:color="FFFFFF" w:sz="0"/>
+              <w:left w:val="none" w:color="FFFFFF" w:sz="0"/>
+              <w:bottom w:val="none" w:color="FFFFFF" w:sz="0"/>
+              <w:right w:val="none" w:color="FFFFFF" w:sz="0"/>
+            </w:tcBorders>
+          </w:tcPr>
+          <w:p/>
+        </w:tc>
+      </w:tr>
+      <w:tr>
+        <w:trPr>
+          <w:trHeight w:val="2000" w:hRule="atLeast"/>
+        </w:trPr>
+        <w:tc>
+          <w:tcPr>
+            <w:tcW w:type="dxa" w:w="4279"/>
+            <w:tcBorders>
+              <w:top w:val="single" w:color="7A5A00" w:sz="8"/>
+              <w:left w:val="single" w:color="7A5A00" w:sz="8"/>
+              <w:bottom w:val="single" w:color="7A5A00" w:sz="8"/>
+              <w:right w:val="single" w:color="7A5A00" w:sz="8"/>
+            </w:tcBorders>
+            <w:shd w:fill="FFF3B0" w:color="auto" w:val="clear"/>
+            <w:tcMar>
+              <w:top w:type="dxa" w:w="120"/>
+              <w:left w:type="dxa" w:w="160"/>
+              <w:bottom w:type="dxa" w:w="120"/>
+              <w:right w:type="dxa" w:w="160"/>
+            </w:tcMar>
+            <w:vAlign w:val="center"/>
+          </w:tcPr>
+          <w:p>
+            <w:pPr>
+              <w:spacing w:after="40"/>
+              <w:jc w:val="center"/>
+            </w:pPr>
+            <w:r>
+              <w:rPr>
+                <w:rFonts w:ascii="Calibri" w:cs="Calibri" w:eastAsia="Calibri" w:hAnsi="Calibri"/>
+                <w:b/>
+                <w:bCs/>
+                <w:color w:val="7A5A00"/>
+                <w:sz w:val="14"/>
+                <w:szCs w:val="14"/>
+              </w:rPr>
+              <w:t xml:space="preserve">7 · EVIDENCE</w:t>
+            </w:r>
+          </w:p>
+          <w:p>
+            <w:pPr>
+              <w:jc w:val="center"/>
+            </w:pPr>
+            <w:r>
+              <w:rPr>
+                <w:rFonts w:ascii="Georgia" w:cs="Georgia" w:eastAsia="Georgia" w:hAnsi="Georgia"/>
+                <w:b/>
+                <w:bCs/>
+                <w:i/>
+                <w:iCs/>
+                <w:color w:val="7A5A00"/>
+                <w:sz w:val="16"/>
+                <w:szCs w:val="16"/>
+              </w:rPr>
+              <w:t xml:space="preserve">“There are only fourteen pairs of real shoes in this whole entire camp.”</w:t>
+            </w:r>
+          </w:p>
+          <w:p>
+            <w:pPr>
+              <w:jc w:val="center"/>
+            </w:pPr>
+            <w:r>
+              <w:rPr>
+                <w:rFonts w:ascii="Calibri" w:cs="Calibri" w:eastAsia="Calibri" w:hAnsi="Calibri"/>
+                <w:color w:val="645D54"/>
+                <w:sz w:val="12"/>
+                <w:szCs w:val="12"/>
+              </w:rPr>
+              <w:t xml:space="preserve">Chapter 4</w:t>
+            </w:r>
+          </w:p>
+        </w:tc>
+        <w:tc>
+          <w:tcPr>
+            <w:tcW w:type="dxa" w:w="700"/>
+            <w:tcBorders>
+              <w:top w:val="none" w:color="FFFFFF" w:sz="0"/>
+              <w:left w:val="none" w:color="FFFFFF" w:sz="0"/>
+              <w:bottom w:val="none" w:color="FFFFFF" w:sz="0"/>
+              <w:right w:val="none" w:color="FFFFFF" w:sz="0"/>
+            </w:tcBorders>
+          </w:tcPr>
+          <w:p/>
+        </w:tc>
+        <w:tc>
+          <w:tcPr>
+            <w:tcW w:type="dxa" w:w="4279"/>
             <w:tcBorders>
               <w:top w:val="single" w:color="0B447C" w:sz="8"/>
               <w:left w:val="single" w:color="0B447C" w:sz="8"/>
@@ -955,7 +1610,7 @@
                 <w:sz w:val="14"/>
                 <w:szCs w:val="14"/>
               </w:rPr>
-              <w:t xml:space="preserve">5 · IDEA</w:t>
+              <w:t xml:space="preserve">8 · IDEA</w:t>
             </w:r>
           </w:p>
           <w:p>
@@ -973,13 +1628,13 @@
                 <w:sz w:val="26"/>
                 <w:szCs w:val="26"/>
               </w:rPr>
-              <w:t xml:space="preserve">power</w:t>
-            </w:r>
-          </w:p>
-        </w:tc>
-        <w:tc>
-          <w:tcPr>
-            <w:tcW w:type="dxa" w:w="4746"/>
+              <w:t xml:space="preserve">survival</w:t>
+            </w:r>
+          </w:p>
+        </w:tc>
+        <w:tc>
+          <w:tcPr>
+            <w:tcW w:type="dxa" w:w="700"/>
             <w:tcBorders>
               <w:top w:val="none" w:color="FFFFFF" w:sz="0"/>
               <w:left w:val="none" w:color="FFFFFF" w:sz="0"/>
@@ -991,14 +1646,14 @@
         </w:tc>
         <w:tc>
           <w:tcPr>
-            <w:tcW w:type="dxa" w:w="4746"/>
-            <w:tcBorders>
-              <w:top w:val="single" w:color="7A5A00" w:sz="8"/>
-              <w:left w:val="single" w:color="7A5A00" w:sz="8"/>
-              <w:bottom w:val="single" w:color="7A5A00" w:sz="8"/>
-              <w:right w:val="single" w:color="7A5A00" w:sz="8"/>
-            </w:tcBorders>
-            <w:shd w:fill="FFF3B0" w:color="auto" w:val="clear"/>
+            <w:tcW w:type="dxa" w:w="4279"/>
+            <w:tcBorders>
+              <w:top w:val="single" w:color="1F5C33" w:sz="8"/>
+              <w:left w:val="single" w:color="1F5C33" w:sz="8"/>
+              <w:bottom w:val="single" w:color="1F5C33" w:sz="8"/>
+              <w:right w:val="single" w:color="1F5C33" w:sz="8"/>
+            </w:tcBorders>
+            <w:shd w:fill="DFF0E2" w:color="auto" w:val="clear"/>
             <w:tcMar>
               <w:top w:type="dxa" w:w="120"/>
               <w:left w:type="dxa" w:w="160"/>
@@ -1017,11 +1672,11 @@
                 <w:rFonts w:ascii="Calibri" w:cs="Calibri" w:eastAsia="Calibri" w:hAnsi="Calibri"/>
                 <w:b/>
                 <w:bCs/>
-                <w:color w:val="7A5A00"/>
+                <w:color w:val="1F5C33"/>
                 <w:sz w:val="14"/>
                 <w:szCs w:val="14"/>
               </w:rPr>
-              <w:t xml:space="preserve">4 · EVIDENCE</w:t>
+              <w:t xml:space="preserve">9 · EFFECT</w:t>
             </w:r>
           </w:p>
           <w:p>
@@ -1033,34 +1688,20 @@
                 <w:rFonts w:ascii="Georgia" w:cs="Georgia" w:eastAsia="Georgia" w:hAnsi="Georgia"/>
                 <w:b/>
                 <w:bCs/>
-                <w:i/>
-                <w:iCs/>
-                <w:color w:val="7A5A00"/>
+                <w:i w:val="false"/>
+                <w:iCs w:val="false"/>
+                <w:color w:val="1F5C33"/>
                 <w:sz w:val="16"/>
                 <w:szCs w:val="16"/>
               </w:rPr>
-              <w:t xml:space="preserve">“There are only fourteen pairs of real shoes in this whole entire camp.”</w:t>
-            </w:r>
-          </w:p>
-          <w:p>
-            <w:pPr>
-              <w:jc w:val="center"/>
-            </w:pPr>
-            <w:r>
-              <w:rPr>
-                <w:rFonts w:ascii="Calibri" w:cs="Calibri" w:eastAsia="Calibri" w:hAnsi="Calibri"/>
-                <w:color w:val="645D54"/>
-                <w:sz w:val="12"/>
-                <w:szCs w:val="12"/>
-              </w:rPr>
-              <w:t xml:space="preserve">Chapter 4</w:t>
+              <w:t xml:space="preserve">makes the reader feel how little the camp gives people</w:t>
             </w:r>
           </w:p>
         </w:tc>
       </w:tr>
     </w:tbl>
     <w:sectPr>
-      <w:pgSz w:w="16838" w:h="11906" w:orient="landscape"/>
+      <w:pgSz w:w="23811" w:h="16838" w:orient="landscape"/>
       <w:pgMar w:top="700" w:right="800" w:bottom="700" w:left="800" w:header="708" w:footer="708" w:gutter="0"/>
       <w:pgNumType/>
       <w:docGrid w:linePitch="360"/>

</xml_diff>